<commit_message>
correct descriptive text and add EM descriptive text
</commit_message>
<xml_diff>
--- a/2026/outputs/descriptive_text.docx
+++ b/2026/outputs/descriptive_text.docx
@@ -7,8 +7,14 @@
         <w:pStyle w:val="Normal"/>
       </w:pPr>
       <w:r>
-        <w:t xml:space="preserve">In total (all ecoregions combined), 868 marine mammals (14 species), 1189 seabirds (38 species), 250 marine turtles (4 species), 6605 Holocephali (6 species) and 9 Chondrostei (4 species) were recorded as bycatch during 2025 Records of 41 fish species
-from the ICES fish bycatch reference list were also reported, totaling over 444700 specimens.
+        <w:t xml:space="preserve">In total (all ecoregions combined), 
+868 marine mammals (14 species), 
+1189 seabirds (38 species), 
+250 marine turtles (4 species), 
+26658 Elasmobranchii (64 species), 
+444700 Teleostei (41 species), 
+6605 Holocephali (6 species) and
+9 Chondrostei (4 species) 
 The year 2025 totals 12738582.45 (das) fishing effort and 468220.75 (das) observed effort.</w:t>
       </w:r>
     </w:p>

</xml_diff>